<commit_message>
md files edited docx file
</commit_message>
<xml_diff>
--- a/docs/data.docx
+++ b/docs/data.docx
@@ -22735,15 +22735,7 @@
           <w:sz w:val="24"/>
           <w:szCs w:val="24"/>
         </w:rPr>
-        <w:t xml:space="preserve"> </w:t>
-      </w:r>
-      <w:r>
-        <w:rPr>
-          <w:rFonts w:ascii="Times New Roman" w:hAnsi="Times New Roman" w:cs="Times New Roman"/>
-          <w:sz w:val="24"/>
-          <w:szCs w:val="24"/>
-        </w:rPr>
-        <w:t xml:space="preserve">Agar </w:t>
+        <w:t xml:space="preserve"> Agar </w:t>
       </w:r>
       <w:proofErr w:type="spellStart"/>
       <w:r>
@@ -23958,8 +23950,18 @@
           <w:sz w:val="24"/>
           <w:szCs w:val="24"/>
         </w:rPr>
-        <w:t xml:space="preserve">bhoshqarish </w:t>
-      </w:r>
+        <w:t>bhoshqarish</w:t>
+      </w:r>
+      <w:proofErr w:type="spellEnd"/>
+      <w:r>
+        <w:rPr>
+          <w:rFonts w:ascii="Times New Roman" w:hAnsi="Times New Roman" w:cs="Times New Roman"/>
+          <w:sz w:val="24"/>
+          <w:szCs w:val="24"/>
+        </w:rPr>
+        <w:t xml:space="preserve"> </w:t>
+      </w:r>
+      <w:proofErr w:type="spellStart"/>
       <w:r>
         <w:rPr>
           <w:rFonts w:ascii="Times New Roman" w:hAnsi="Times New Roman" w:cs="Times New Roman"/>
@@ -29098,6 +29100,1401 @@
           <w:szCs w:val="24"/>
         </w:rPr>
       </w:pPr>
+    </w:p>
+    <w:p>
+      <w:pPr>
+        <w:rPr>
+          <w:rFonts w:ascii="Times New Roman" w:hAnsi="Times New Roman" w:cs="Times New Roman"/>
+          <w:sz w:val="24"/>
+          <w:szCs w:val="24"/>
+        </w:rPr>
+      </w:pPr>
+      <w:r>
+        <w:rPr>
+          <w:rFonts w:ascii="Times New Roman" w:hAnsi="Times New Roman" w:cs="Times New Roman"/>
+          <w:sz w:val="24"/>
+          <w:szCs w:val="24"/>
+        </w:rPr>
+        <w:t xml:space="preserve">49. </w:t>
+      </w:r>
+      <w:proofErr w:type="spellStart"/>
+      <w:r>
+        <w:rPr>
+          <w:rFonts w:ascii="Times New Roman" w:hAnsi="Times New Roman" w:cs="Times New Roman"/>
+          <w:sz w:val="24"/>
+          <w:szCs w:val="24"/>
+        </w:rPr>
+        <w:t>Shortnoma</w:t>
+      </w:r>
+      <w:proofErr w:type="spellEnd"/>
+      <w:r>
+        <w:rPr>
+          <w:rFonts w:ascii="Times New Roman" w:hAnsi="Times New Roman" w:cs="Times New Roman"/>
+          <w:sz w:val="24"/>
+          <w:szCs w:val="24"/>
+        </w:rPr>
+        <w:t xml:space="preserve"> </w:t>
+      </w:r>
+      <w:proofErr w:type="spellStart"/>
+      <w:r>
+        <w:rPr>
+          <w:rFonts w:ascii="Times New Roman" w:hAnsi="Times New Roman" w:cs="Times New Roman"/>
+          <w:sz w:val="24"/>
+          <w:szCs w:val="24"/>
+        </w:rPr>
+        <w:t>bilan</w:t>
+      </w:r>
+      <w:proofErr w:type="spellEnd"/>
+      <w:r>
+        <w:rPr>
+          <w:rFonts w:ascii="Times New Roman" w:hAnsi="Times New Roman" w:cs="Times New Roman"/>
+          <w:sz w:val="24"/>
+          <w:szCs w:val="24"/>
+        </w:rPr>
+        <w:t xml:space="preserve"> </w:t>
+      </w:r>
+      <w:proofErr w:type="spellStart"/>
+      <w:r>
+        <w:rPr>
+          <w:rFonts w:ascii="Times New Roman" w:hAnsi="Times New Roman" w:cs="Times New Roman"/>
+          <w:sz w:val="24"/>
+          <w:szCs w:val="24"/>
+        </w:rPr>
+        <w:t>to'lov</w:t>
+      </w:r>
+      <w:proofErr w:type="spellEnd"/>
+      <w:r>
+        <w:rPr>
+          <w:rFonts w:ascii="Times New Roman" w:hAnsi="Times New Roman" w:cs="Times New Roman"/>
+          <w:sz w:val="24"/>
+          <w:szCs w:val="24"/>
+        </w:rPr>
+        <w:t xml:space="preserve"> </w:t>
+      </w:r>
+      <w:proofErr w:type="spellStart"/>
+      <w:r>
+        <w:rPr>
+          <w:rFonts w:ascii="Times New Roman" w:hAnsi="Times New Roman" w:cs="Times New Roman"/>
+          <w:sz w:val="24"/>
+          <w:szCs w:val="24"/>
+        </w:rPr>
+        <w:t>qilayotganda</w:t>
+      </w:r>
+      <w:proofErr w:type="spellEnd"/>
+      <w:r>
+        <w:rPr>
+          <w:rFonts w:ascii="Times New Roman" w:hAnsi="Times New Roman" w:cs="Times New Roman"/>
+          <w:sz w:val="24"/>
+          <w:szCs w:val="24"/>
+        </w:rPr>
+        <w:t xml:space="preserve">, </w:t>
+      </w:r>
+      <w:proofErr w:type="spellStart"/>
+      <w:r>
+        <w:rPr>
+          <w:rFonts w:ascii="Times New Roman" w:hAnsi="Times New Roman" w:cs="Times New Roman"/>
+          <w:sz w:val="24"/>
+          <w:szCs w:val="24"/>
+        </w:rPr>
+        <w:t>to'lov</w:t>
+      </w:r>
+      <w:proofErr w:type="spellEnd"/>
+      <w:r>
+        <w:rPr>
+          <w:rFonts w:ascii="Times New Roman" w:hAnsi="Times New Roman" w:cs="Times New Roman"/>
+          <w:sz w:val="24"/>
+          <w:szCs w:val="24"/>
+        </w:rPr>
+        <w:t xml:space="preserve"> </w:t>
+      </w:r>
+      <w:proofErr w:type="spellStart"/>
+      <w:r>
+        <w:rPr>
+          <w:rFonts w:ascii="Times New Roman" w:hAnsi="Times New Roman" w:cs="Times New Roman"/>
+          <w:sz w:val="24"/>
+          <w:szCs w:val="24"/>
+        </w:rPr>
+        <w:t>maqsadi</w:t>
+      </w:r>
+      <w:r>
+        <w:rPr>
+          <w:rFonts w:ascii="Times New Roman" w:hAnsi="Times New Roman" w:cs="Times New Roman"/>
+          <w:sz w:val="24"/>
+          <w:szCs w:val="24"/>
+        </w:rPr>
+        <w:t>ga</w:t>
+      </w:r>
+      <w:proofErr w:type="spellEnd"/>
+      <w:r>
+        <w:rPr>
+          <w:rFonts w:ascii="Times New Roman" w:hAnsi="Times New Roman" w:cs="Times New Roman"/>
+          <w:sz w:val="24"/>
+          <w:szCs w:val="24"/>
+        </w:rPr>
+        <w:t xml:space="preserve"> </w:t>
+      </w:r>
+      <w:proofErr w:type="spellStart"/>
+      <w:r>
+        <w:rPr>
+          <w:rFonts w:ascii="Times New Roman" w:hAnsi="Times New Roman" w:cs="Times New Roman"/>
+          <w:sz w:val="24"/>
+          <w:szCs w:val="24"/>
+        </w:rPr>
+        <w:t xml:space="preserve">nima </w:t>
+      </w:r>
+      <w:r>
+        <w:rPr>
+          <w:rFonts w:ascii="Times New Roman" w:hAnsi="Times New Roman" w:cs="Times New Roman"/>
+          <w:sz w:val="24"/>
+          <w:szCs w:val="24"/>
+        </w:rPr>
+        <w:t>ko'rsatis</w:t>
+      </w:r>
+      <w:r>
+        <w:rPr>
+          <w:rFonts w:ascii="Times New Roman" w:hAnsi="Times New Roman" w:cs="Times New Roman"/>
+          <w:sz w:val="24"/>
+          <w:szCs w:val="24"/>
+        </w:rPr>
+        <w:t>h</w:t>
+      </w:r>
+      <w:proofErr w:type="spellEnd"/>
+      <w:r>
+        <w:rPr>
+          <w:rFonts w:ascii="Times New Roman" w:hAnsi="Times New Roman" w:cs="Times New Roman"/>
+          <w:sz w:val="24"/>
+          <w:szCs w:val="24"/>
+        </w:rPr>
+        <w:t xml:space="preserve"> </w:t>
+      </w:r>
+      <w:proofErr w:type="spellStart"/>
+      <w:r>
+        <w:rPr>
+          <w:rFonts w:ascii="Times New Roman" w:hAnsi="Times New Roman" w:cs="Times New Roman"/>
+          <w:sz w:val="24"/>
+          <w:szCs w:val="24"/>
+        </w:rPr>
+        <w:t>kerak</w:t>
+      </w:r>
+      <w:proofErr w:type="spellEnd"/>
+      <w:r>
+        <w:rPr>
+          <w:rFonts w:ascii="Times New Roman" w:hAnsi="Times New Roman" w:cs="Times New Roman"/>
+          <w:sz w:val="24"/>
+          <w:szCs w:val="24"/>
+        </w:rPr>
+        <w:t>?</w:t>
+      </w:r>
+    </w:p>
+    <w:p>
+      <w:pPr>
+        <w:rPr>
+          <w:rFonts w:ascii="Times New Roman" w:hAnsi="Times New Roman" w:cs="Times New Roman"/>
+          <w:sz w:val="24"/>
+          <w:szCs w:val="24"/>
+        </w:rPr>
+      </w:pPr>
+      <w:r>
+        <w:rPr>
+          <w:rFonts w:ascii="Times New Roman" w:hAnsi="Times New Roman" w:cs="Times New Roman"/>
+          <w:sz w:val="24"/>
+          <w:szCs w:val="24"/>
+        </w:rPr>
+        <w:t xml:space="preserve">Bank </w:t>
+      </w:r>
+      <w:proofErr w:type="spellStart"/>
+      <w:r>
+        <w:rPr>
+          <w:rFonts w:ascii="Times New Roman" w:hAnsi="Times New Roman" w:cs="Times New Roman"/>
+          <w:sz w:val="24"/>
+          <w:szCs w:val="24"/>
+        </w:rPr>
+        <w:t>orqali</w:t>
+      </w:r>
+      <w:proofErr w:type="spellEnd"/>
+      <w:r>
+        <w:rPr>
+          <w:rFonts w:ascii="Times New Roman" w:hAnsi="Times New Roman" w:cs="Times New Roman"/>
+          <w:sz w:val="24"/>
+          <w:szCs w:val="24"/>
+        </w:rPr>
+        <w:t xml:space="preserve"> </w:t>
+      </w:r>
+      <w:proofErr w:type="spellStart"/>
+      <w:r>
+        <w:rPr>
+          <w:rFonts w:ascii="Times New Roman" w:hAnsi="Times New Roman" w:cs="Times New Roman"/>
+          <w:sz w:val="24"/>
+          <w:szCs w:val="24"/>
+        </w:rPr>
+        <w:t>to'lov</w:t>
+      </w:r>
+      <w:proofErr w:type="spellEnd"/>
+      <w:r>
+        <w:rPr>
+          <w:rFonts w:ascii="Times New Roman" w:hAnsi="Times New Roman" w:cs="Times New Roman"/>
+          <w:sz w:val="24"/>
+          <w:szCs w:val="24"/>
+        </w:rPr>
+        <w:t xml:space="preserve"> </w:t>
+      </w:r>
+      <w:proofErr w:type="spellStart"/>
+      <w:r>
+        <w:rPr>
+          <w:rFonts w:ascii="Times New Roman" w:hAnsi="Times New Roman" w:cs="Times New Roman"/>
+          <w:sz w:val="24"/>
+          <w:szCs w:val="24"/>
+        </w:rPr>
+        <w:t>qilinganda</w:t>
+      </w:r>
+      <w:proofErr w:type="spellEnd"/>
+      <w:r>
+        <w:rPr>
+          <w:rFonts w:ascii="Times New Roman" w:hAnsi="Times New Roman" w:cs="Times New Roman"/>
+          <w:sz w:val="24"/>
+          <w:szCs w:val="24"/>
+        </w:rPr>
+        <w:t xml:space="preserve">, agar </w:t>
+      </w:r>
+      <w:proofErr w:type="spellStart"/>
+      <w:r>
+        <w:rPr>
+          <w:rFonts w:ascii="Times New Roman" w:hAnsi="Times New Roman" w:cs="Times New Roman"/>
+          <w:sz w:val="24"/>
+          <w:szCs w:val="24"/>
+        </w:rPr>
+        <w:t>bitta</w:t>
+      </w:r>
+      <w:proofErr w:type="spellEnd"/>
+      <w:r>
+        <w:rPr>
+          <w:rFonts w:ascii="Times New Roman" w:hAnsi="Times New Roman" w:cs="Times New Roman"/>
+          <w:sz w:val="24"/>
+          <w:szCs w:val="24"/>
+        </w:rPr>
+        <w:t xml:space="preserve"> </w:t>
+      </w:r>
+      <w:proofErr w:type="spellStart"/>
+      <w:r>
+        <w:rPr>
+          <w:rFonts w:ascii="Times New Roman" w:hAnsi="Times New Roman" w:cs="Times New Roman"/>
+          <w:sz w:val="24"/>
+          <w:szCs w:val="24"/>
+        </w:rPr>
+        <w:t>firmaga</w:t>
+      </w:r>
+      <w:proofErr w:type="spellEnd"/>
+      <w:r>
+        <w:rPr>
+          <w:rFonts w:ascii="Times New Roman" w:hAnsi="Times New Roman" w:cs="Times New Roman"/>
+          <w:sz w:val="24"/>
+          <w:szCs w:val="24"/>
+        </w:rPr>
+        <w:t xml:space="preserve"> </w:t>
+      </w:r>
+      <w:proofErr w:type="spellStart"/>
+      <w:r>
+        <w:rPr>
+          <w:rFonts w:ascii="Times New Roman" w:hAnsi="Times New Roman" w:cs="Times New Roman"/>
+          <w:sz w:val="24"/>
+          <w:szCs w:val="24"/>
+        </w:rPr>
+        <w:t>bo'lsa</w:t>
+      </w:r>
+      <w:proofErr w:type="spellEnd"/>
+      <w:r>
+        <w:rPr>
+          <w:rFonts w:ascii="Times New Roman" w:hAnsi="Times New Roman" w:cs="Times New Roman"/>
+          <w:sz w:val="24"/>
+          <w:szCs w:val="24"/>
+        </w:rPr>
+        <w:t xml:space="preserve"> </w:t>
+      </w:r>
+      <w:proofErr w:type="spellStart"/>
+      <w:r>
+        <w:rPr>
+          <w:rFonts w:ascii="Times New Roman" w:hAnsi="Times New Roman" w:cs="Times New Roman"/>
+          <w:sz w:val="24"/>
+          <w:szCs w:val="24"/>
+        </w:rPr>
+        <w:t>ofertaga</w:t>
+      </w:r>
+      <w:proofErr w:type="spellEnd"/>
+      <w:r>
+        <w:rPr>
+          <w:rFonts w:ascii="Times New Roman" w:hAnsi="Times New Roman" w:cs="Times New Roman"/>
+          <w:sz w:val="24"/>
+          <w:szCs w:val="24"/>
+        </w:rPr>
+        <w:t xml:space="preserve"> </w:t>
+      </w:r>
+      <w:proofErr w:type="spellStart"/>
+      <w:r>
+        <w:rPr>
+          <w:rFonts w:ascii="Times New Roman" w:hAnsi="Times New Roman" w:cs="Times New Roman"/>
+          <w:sz w:val="24"/>
+          <w:szCs w:val="24"/>
+        </w:rPr>
+        <w:t>asosan</w:t>
+      </w:r>
+      <w:proofErr w:type="spellEnd"/>
+      <w:r>
+        <w:rPr>
+          <w:rFonts w:ascii="Times New Roman" w:hAnsi="Times New Roman" w:cs="Times New Roman"/>
+          <w:sz w:val="24"/>
+          <w:szCs w:val="24"/>
+        </w:rPr>
+        <w:t xml:space="preserve"> de </w:t>
+      </w:r>
+      <w:proofErr w:type="spellStart"/>
+      <w:r>
+        <w:rPr>
+          <w:rFonts w:ascii="Times New Roman" w:hAnsi="Times New Roman" w:cs="Times New Roman"/>
+          <w:sz w:val="24"/>
+          <w:szCs w:val="24"/>
+        </w:rPr>
+        <w:t>yozsa</w:t>
+      </w:r>
+      <w:proofErr w:type="spellEnd"/>
+      <w:r>
+        <w:rPr>
+          <w:rFonts w:ascii="Times New Roman" w:hAnsi="Times New Roman" w:cs="Times New Roman"/>
+          <w:sz w:val="24"/>
+          <w:szCs w:val="24"/>
+        </w:rPr>
+        <w:t xml:space="preserve"> </w:t>
+      </w:r>
+      <w:proofErr w:type="spellStart"/>
+      <w:r>
+        <w:rPr>
+          <w:rFonts w:ascii="Times New Roman" w:hAnsi="Times New Roman" w:cs="Times New Roman"/>
+          <w:sz w:val="24"/>
+          <w:szCs w:val="24"/>
+        </w:rPr>
+        <w:t>bo'ldi</w:t>
+      </w:r>
+      <w:proofErr w:type="spellEnd"/>
+      <w:r>
+        <w:rPr>
+          <w:rFonts w:ascii="Times New Roman" w:hAnsi="Times New Roman" w:cs="Times New Roman"/>
+          <w:sz w:val="24"/>
+          <w:szCs w:val="24"/>
+        </w:rPr>
+        <w:t xml:space="preserve">, agar </w:t>
+      </w:r>
+      <w:proofErr w:type="spellStart"/>
+      <w:r>
+        <w:rPr>
+          <w:rFonts w:ascii="Times New Roman" w:hAnsi="Times New Roman" w:cs="Times New Roman"/>
+          <w:sz w:val="24"/>
+          <w:szCs w:val="24"/>
+        </w:rPr>
+        <w:t>buxgalteriya</w:t>
+      </w:r>
+      <w:proofErr w:type="spellEnd"/>
+      <w:r>
+        <w:rPr>
+          <w:rFonts w:ascii="Times New Roman" w:hAnsi="Times New Roman" w:cs="Times New Roman"/>
+          <w:sz w:val="24"/>
+          <w:szCs w:val="24"/>
+        </w:rPr>
+        <w:t xml:space="preserve"> </w:t>
+      </w:r>
+      <w:proofErr w:type="spellStart"/>
+      <w:r>
+        <w:rPr>
+          <w:rFonts w:ascii="Times New Roman" w:hAnsi="Times New Roman" w:cs="Times New Roman"/>
+          <w:sz w:val="24"/>
+          <w:szCs w:val="24"/>
+        </w:rPr>
+        <w:t>kabinetiga</w:t>
+      </w:r>
+      <w:proofErr w:type="spellEnd"/>
+      <w:r>
+        <w:rPr>
+          <w:rFonts w:ascii="Times New Roman" w:hAnsi="Times New Roman" w:cs="Times New Roman"/>
+          <w:sz w:val="24"/>
+          <w:szCs w:val="24"/>
+        </w:rPr>
+        <w:t xml:space="preserve"> </w:t>
+      </w:r>
+      <w:proofErr w:type="spellStart"/>
+      <w:r>
+        <w:rPr>
+          <w:rFonts w:ascii="Times New Roman" w:hAnsi="Times New Roman" w:cs="Times New Roman"/>
+          <w:sz w:val="24"/>
+          <w:szCs w:val="24"/>
+        </w:rPr>
+        <w:t>to'lov</w:t>
+      </w:r>
+      <w:proofErr w:type="spellEnd"/>
+      <w:r>
+        <w:rPr>
+          <w:rFonts w:ascii="Times New Roman" w:hAnsi="Times New Roman" w:cs="Times New Roman"/>
+          <w:sz w:val="24"/>
+          <w:szCs w:val="24"/>
+        </w:rPr>
+        <w:t xml:space="preserve"> </w:t>
+      </w:r>
+      <w:proofErr w:type="spellStart"/>
+      <w:r>
+        <w:rPr>
+          <w:rFonts w:ascii="Times New Roman" w:hAnsi="Times New Roman" w:cs="Times New Roman"/>
+          <w:sz w:val="24"/>
+          <w:szCs w:val="24"/>
+        </w:rPr>
+        <w:t>qilayotgan</w:t>
+      </w:r>
+      <w:proofErr w:type="spellEnd"/>
+      <w:r>
+        <w:rPr>
+          <w:rFonts w:ascii="Times New Roman" w:hAnsi="Times New Roman" w:cs="Times New Roman"/>
+          <w:sz w:val="24"/>
+          <w:szCs w:val="24"/>
+        </w:rPr>
+        <w:t xml:space="preserve"> </w:t>
+      </w:r>
+      <w:proofErr w:type="spellStart"/>
+      <w:r>
+        <w:rPr>
+          <w:rFonts w:ascii="Times New Roman" w:hAnsi="Times New Roman" w:cs="Times New Roman"/>
+          <w:sz w:val="24"/>
+          <w:szCs w:val="24"/>
+        </w:rPr>
+        <w:t>bo'lsa</w:t>
+      </w:r>
+      <w:proofErr w:type="spellEnd"/>
+      <w:r>
+        <w:rPr>
+          <w:rFonts w:ascii="Times New Roman" w:hAnsi="Times New Roman" w:cs="Times New Roman"/>
+          <w:sz w:val="24"/>
+          <w:szCs w:val="24"/>
+        </w:rPr>
+        <w:t xml:space="preserve"> </w:t>
+      </w:r>
+      <w:proofErr w:type="spellStart"/>
+      <w:r>
+        <w:rPr>
+          <w:rFonts w:ascii="Times New Roman" w:hAnsi="Times New Roman" w:cs="Times New Roman"/>
+          <w:sz w:val="24"/>
+          <w:szCs w:val="24"/>
+        </w:rPr>
+        <w:t>sotib</w:t>
+      </w:r>
+      <w:proofErr w:type="spellEnd"/>
+      <w:r>
+        <w:rPr>
+          <w:rFonts w:ascii="Times New Roman" w:hAnsi="Times New Roman" w:cs="Times New Roman"/>
+          <w:sz w:val="24"/>
+          <w:szCs w:val="24"/>
+        </w:rPr>
+        <w:t xml:space="preserve"> </w:t>
+      </w:r>
+      <w:proofErr w:type="spellStart"/>
+      <w:r>
+        <w:rPr>
+          <w:rFonts w:ascii="Times New Roman" w:hAnsi="Times New Roman" w:cs="Times New Roman"/>
+          <w:sz w:val="24"/>
+          <w:szCs w:val="24"/>
+        </w:rPr>
+        <w:t>olayotgan</w:t>
+      </w:r>
+      <w:proofErr w:type="spellEnd"/>
+      <w:r>
+        <w:rPr>
+          <w:rFonts w:ascii="Times New Roman" w:hAnsi="Times New Roman" w:cs="Times New Roman"/>
+          <w:sz w:val="24"/>
+          <w:szCs w:val="24"/>
+        </w:rPr>
+        <w:t xml:space="preserve"> </w:t>
+      </w:r>
+      <w:proofErr w:type="spellStart"/>
+      <w:r>
+        <w:rPr>
+          <w:rFonts w:ascii="Times New Roman" w:hAnsi="Times New Roman" w:cs="Times New Roman"/>
+          <w:sz w:val="24"/>
+          <w:szCs w:val="24"/>
+        </w:rPr>
+        <w:t>buxgalterning</w:t>
+      </w:r>
+      <w:proofErr w:type="spellEnd"/>
+      <w:r>
+        <w:rPr>
+          <w:rFonts w:ascii="Times New Roman" w:hAnsi="Times New Roman" w:cs="Times New Roman"/>
+          <w:sz w:val="24"/>
+          <w:szCs w:val="24"/>
+        </w:rPr>
+        <w:t xml:space="preserve"> PINFL </w:t>
+      </w:r>
+      <w:proofErr w:type="spellStart"/>
+      <w:r>
+        <w:rPr>
+          <w:rFonts w:ascii="Times New Roman" w:hAnsi="Times New Roman" w:cs="Times New Roman"/>
+          <w:sz w:val="24"/>
+          <w:szCs w:val="24"/>
+        </w:rPr>
+        <w:t>raqamini</w:t>
+      </w:r>
+      <w:proofErr w:type="spellEnd"/>
+      <w:r>
+        <w:rPr>
+          <w:rFonts w:ascii="Times New Roman" w:hAnsi="Times New Roman" w:cs="Times New Roman"/>
+          <w:sz w:val="24"/>
+          <w:szCs w:val="24"/>
+        </w:rPr>
+        <w:t xml:space="preserve"> </w:t>
+      </w:r>
+      <w:proofErr w:type="spellStart"/>
+      <w:r>
+        <w:rPr>
+          <w:rFonts w:ascii="Times New Roman" w:hAnsi="Times New Roman" w:cs="Times New Roman"/>
+          <w:sz w:val="24"/>
+          <w:szCs w:val="24"/>
+        </w:rPr>
+        <w:t>izohda</w:t>
+      </w:r>
+      <w:proofErr w:type="spellEnd"/>
+      <w:r>
+        <w:rPr>
+          <w:rFonts w:ascii="Times New Roman" w:hAnsi="Times New Roman" w:cs="Times New Roman"/>
+          <w:sz w:val="24"/>
+          <w:szCs w:val="24"/>
+        </w:rPr>
+        <w:t xml:space="preserve"> </w:t>
+      </w:r>
+      <w:proofErr w:type="spellStart"/>
+      <w:r>
+        <w:rPr>
+          <w:rFonts w:ascii="Times New Roman" w:hAnsi="Times New Roman" w:cs="Times New Roman"/>
+          <w:sz w:val="24"/>
+          <w:szCs w:val="24"/>
+        </w:rPr>
+        <w:t>ko'rsatishni</w:t>
+      </w:r>
+      <w:proofErr w:type="spellEnd"/>
+      <w:r>
+        <w:rPr>
+          <w:rFonts w:ascii="Times New Roman" w:hAnsi="Times New Roman" w:cs="Times New Roman"/>
+          <w:sz w:val="24"/>
+          <w:szCs w:val="24"/>
+        </w:rPr>
+        <w:t xml:space="preserve"> </w:t>
+      </w:r>
+      <w:proofErr w:type="spellStart"/>
+      <w:r>
+        <w:rPr>
+          <w:rFonts w:ascii="Times New Roman" w:hAnsi="Times New Roman" w:cs="Times New Roman"/>
+          <w:sz w:val="24"/>
+          <w:szCs w:val="24"/>
+        </w:rPr>
+        <w:t>unutmang</w:t>
+      </w:r>
+      <w:proofErr w:type="spellEnd"/>
+      <w:r>
+        <w:rPr>
+          <w:rFonts w:ascii="Times New Roman" w:hAnsi="Times New Roman" w:cs="Times New Roman"/>
+          <w:sz w:val="24"/>
+          <w:szCs w:val="24"/>
+        </w:rPr>
+        <w:t xml:space="preserve">. Bu </w:t>
+      </w:r>
+      <w:proofErr w:type="spellStart"/>
+      <w:r>
+        <w:rPr>
+          <w:rFonts w:ascii="Times New Roman" w:hAnsi="Times New Roman" w:cs="Times New Roman"/>
+          <w:sz w:val="24"/>
+          <w:szCs w:val="24"/>
+        </w:rPr>
+        <w:t>to'lovni</w:t>
+      </w:r>
+      <w:proofErr w:type="spellEnd"/>
+      <w:r>
+        <w:rPr>
+          <w:rFonts w:ascii="Times New Roman" w:hAnsi="Times New Roman" w:cs="Times New Roman"/>
+          <w:sz w:val="24"/>
+          <w:szCs w:val="24"/>
+        </w:rPr>
+        <w:t xml:space="preserve"> </w:t>
+      </w:r>
+      <w:proofErr w:type="spellStart"/>
+      <w:r>
+        <w:rPr>
+          <w:rFonts w:ascii="Times New Roman" w:hAnsi="Times New Roman" w:cs="Times New Roman"/>
+          <w:sz w:val="24"/>
+          <w:szCs w:val="24"/>
+        </w:rPr>
+        <w:t>tezroq</w:t>
+      </w:r>
+      <w:proofErr w:type="spellEnd"/>
+      <w:r>
+        <w:rPr>
+          <w:rFonts w:ascii="Times New Roman" w:hAnsi="Times New Roman" w:cs="Times New Roman"/>
+          <w:sz w:val="24"/>
+          <w:szCs w:val="24"/>
+        </w:rPr>
+        <w:t xml:space="preserve"> </w:t>
+      </w:r>
+      <w:proofErr w:type="spellStart"/>
+      <w:r>
+        <w:rPr>
+          <w:rFonts w:ascii="Times New Roman" w:hAnsi="Times New Roman" w:cs="Times New Roman"/>
+          <w:sz w:val="24"/>
+          <w:szCs w:val="24"/>
+        </w:rPr>
+        <w:t>tasdiqlanishiga</w:t>
+      </w:r>
+      <w:proofErr w:type="spellEnd"/>
+      <w:r>
+        <w:rPr>
+          <w:rFonts w:ascii="Times New Roman" w:hAnsi="Times New Roman" w:cs="Times New Roman"/>
+          <w:sz w:val="24"/>
+          <w:szCs w:val="24"/>
+        </w:rPr>
+        <w:t xml:space="preserve"> </w:t>
+      </w:r>
+      <w:proofErr w:type="spellStart"/>
+      <w:r>
+        <w:rPr>
+          <w:rFonts w:ascii="Times New Roman" w:hAnsi="Times New Roman" w:cs="Times New Roman"/>
+          <w:sz w:val="24"/>
+          <w:szCs w:val="24"/>
+        </w:rPr>
+        <w:t>yordam</w:t>
+      </w:r>
+      <w:proofErr w:type="spellEnd"/>
+      <w:r>
+        <w:rPr>
+          <w:rFonts w:ascii="Times New Roman" w:hAnsi="Times New Roman" w:cs="Times New Roman"/>
+          <w:sz w:val="24"/>
+          <w:szCs w:val="24"/>
+        </w:rPr>
+        <w:t xml:space="preserve"> </w:t>
+      </w:r>
+      <w:proofErr w:type="spellStart"/>
+      <w:r>
+        <w:rPr>
+          <w:rFonts w:ascii="Times New Roman" w:hAnsi="Times New Roman" w:cs="Times New Roman"/>
+          <w:sz w:val="24"/>
+          <w:szCs w:val="24"/>
+        </w:rPr>
+        <w:t>beradi</w:t>
+      </w:r>
+      <w:proofErr w:type="spellEnd"/>
+      <w:r>
+        <w:rPr>
+          <w:rFonts w:ascii="Times New Roman" w:hAnsi="Times New Roman" w:cs="Times New Roman"/>
+          <w:sz w:val="24"/>
+          <w:szCs w:val="24"/>
+        </w:rPr>
+        <w:t>.</w:t>
+      </w:r>
+    </w:p>
+    <w:p>
+      <w:pPr>
+        <w:rPr>
+          <w:rFonts w:ascii="Times New Roman" w:hAnsi="Times New Roman" w:cs="Times New Roman"/>
+          <w:sz w:val="24"/>
+          <w:szCs w:val="24"/>
+        </w:rPr>
+      </w:pPr>
+    </w:p>
+    <w:p>
+      <w:pPr>
+        <w:rPr>
+          <w:rFonts w:ascii="Times New Roman" w:hAnsi="Times New Roman" w:cs="Times New Roman"/>
+          <w:sz w:val="24"/>
+          <w:szCs w:val="24"/>
+        </w:rPr>
+      </w:pPr>
+      <w:r>
+        <w:rPr>
+          <w:rFonts w:ascii="Times New Roman" w:hAnsi="Times New Roman" w:cs="Times New Roman"/>
+          <w:sz w:val="24"/>
+          <w:szCs w:val="24"/>
+        </w:rPr>
+        <w:t xml:space="preserve">50. </w:t>
+      </w:r>
+      <w:proofErr w:type="spellStart"/>
+      <w:r>
+        <w:rPr>
+          <w:rFonts w:ascii="Times New Roman" w:hAnsi="Times New Roman" w:cs="Times New Roman"/>
+          <w:sz w:val="24"/>
+          <w:szCs w:val="24"/>
+        </w:rPr>
+        <w:t>To'lovni</w:t>
+      </w:r>
+      <w:proofErr w:type="spellEnd"/>
+      <w:r>
+        <w:rPr>
+          <w:rFonts w:ascii="Times New Roman" w:hAnsi="Times New Roman" w:cs="Times New Roman"/>
+          <w:sz w:val="24"/>
+          <w:szCs w:val="24"/>
+        </w:rPr>
+        <w:t xml:space="preserve"> </w:t>
+      </w:r>
+      <w:proofErr w:type="spellStart"/>
+      <w:r>
+        <w:rPr>
+          <w:rFonts w:ascii="Times New Roman" w:hAnsi="Times New Roman" w:cs="Times New Roman"/>
+          <w:sz w:val="24"/>
+          <w:szCs w:val="24"/>
+        </w:rPr>
+        <w:t>qanday</w:t>
+      </w:r>
+      <w:proofErr w:type="spellEnd"/>
+      <w:r>
+        <w:rPr>
+          <w:rFonts w:ascii="Times New Roman" w:hAnsi="Times New Roman" w:cs="Times New Roman"/>
+          <w:sz w:val="24"/>
+          <w:szCs w:val="24"/>
+        </w:rPr>
+        <w:t xml:space="preserve"> </w:t>
+      </w:r>
+      <w:proofErr w:type="spellStart"/>
+      <w:r>
+        <w:rPr>
+          <w:rFonts w:ascii="Times New Roman" w:hAnsi="Times New Roman" w:cs="Times New Roman"/>
+          <w:sz w:val="24"/>
+          <w:szCs w:val="24"/>
+        </w:rPr>
+        <w:t>usulda</w:t>
+      </w:r>
+      <w:proofErr w:type="spellEnd"/>
+      <w:r>
+        <w:rPr>
+          <w:rFonts w:ascii="Times New Roman" w:hAnsi="Times New Roman" w:cs="Times New Roman"/>
+          <w:sz w:val="24"/>
+          <w:szCs w:val="24"/>
+        </w:rPr>
+        <w:t xml:space="preserve"> </w:t>
+      </w:r>
+      <w:proofErr w:type="spellStart"/>
+      <w:r>
+        <w:rPr>
+          <w:rFonts w:ascii="Times New Roman" w:hAnsi="Times New Roman" w:cs="Times New Roman"/>
+          <w:sz w:val="24"/>
+          <w:szCs w:val="24"/>
+        </w:rPr>
+        <w:t>amalga</w:t>
+      </w:r>
+      <w:proofErr w:type="spellEnd"/>
+      <w:r>
+        <w:rPr>
+          <w:rFonts w:ascii="Times New Roman" w:hAnsi="Times New Roman" w:cs="Times New Roman"/>
+          <w:sz w:val="24"/>
+          <w:szCs w:val="24"/>
+        </w:rPr>
+        <w:t xml:space="preserve"> </w:t>
+      </w:r>
+      <w:proofErr w:type="spellStart"/>
+      <w:r>
+        <w:rPr>
+          <w:rFonts w:ascii="Times New Roman" w:hAnsi="Times New Roman" w:cs="Times New Roman"/>
+          <w:sz w:val="24"/>
+          <w:szCs w:val="24"/>
+        </w:rPr>
+        <w:t>oshirish</w:t>
+      </w:r>
+      <w:proofErr w:type="spellEnd"/>
+      <w:r>
+        <w:rPr>
+          <w:rFonts w:ascii="Times New Roman" w:hAnsi="Times New Roman" w:cs="Times New Roman"/>
+          <w:sz w:val="24"/>
+          <w:szCs w:val="24"/>
+        </w:rPr>
+        <w:t xml:space="preserve"> </w:t>
+      </w:r>
+      <w:proofErr w:type="spellStart"/>
+      <w:r>
+        <w:rPr>
+          <w:rFonts w:ascii="Times New Roman" w:hAnsi="Times New Roman" w:cs="Times New Roman"/>
+          <w:sz w:val="24"/>
+          <w:szCs w:val="24"/>
+        </w:rPr>
+        <w:t>mumkin</w:t>
+      </w:r>
+      <w:proofErr w:type="spellEnd"/>
+      <w:r>
+        <w:rPr>
+          <w:rFonts w:ascii="Times New Roman" w:hAnsi="Times New Roman" w:cs="Times New Roman"/>
+          <w:sz w:val="24"/>
+          <w:szCs w:val="24"/>
+        </w:rPr>
+        <w:t>?</w:t>
+      </w:r>
+    </w:p>
+    <w:p>
+      <w:pPr>
+        <w:rPr>
+          <w:rFonts w:ascii="Times New Roman" w:hAnsi="Times New Roman" w:cs="Times New Roman"/>
+          <w:sz w:val="24"/>
+          <w:szCs w:val="24"/>
+        </w:rPr>
+      </w:pPr>
+      <w:proofErr w:type="spellStart"/>
+      <w:r>
+        <w:rPr>
+          <w:rFonts w:ascii="Times New Roman" w:hAnsi="Times New Roman" w:cs="Times New Roman"/>
+          <w:sz w:val="24"/>
+          <w:szCs w:val="24"/>
+        </w:rPr>
+        <w:t>To'lovni</w:t>
+      </w:r>
+      <w:proofErr w:type="spellEnd"/>
+      <w:r>
+        <w:rPr>
+          <w:rFonts w:ascii="Times New Roman" w:hAnsi="Times New Roman" w:cs="Times New Roman"/>
+          <w:sz w:val="24"/>
+          <w:szCs w:val="24"/>
+        </w:rPr>
+        <w:t xml:space="preserve"> </w:t>
+      </w:r>
+      <w:proofErr w:type="spellStart"/>
+      <w:r>
+        <w:rPr>
+          <w:rFonts w:ascii="Times New Roman" w:hAnsi="Times New Roman" w:cs="Times New Roman"/>
+          <w:sz w:val="24"/>
+          <w:szCs w:val="24"/>
+        </w:rPr>
+        <w:t>quyidagi</w:t>
+      </w:r>
+      <w:proofErr w:type="spellEnd"/>
+      <w:r>
+        <w:rPr>
+          <w:rFonts w:ascii="Times New Roman" w:hAnsi="Times New Roman" w:cs="Times New Roman"/>
+          <w:sz w:val="24"/>
+          <w:szCs w:val="24"/>
+        </w:rPr>
+        <w:t xml:space="preserve"> </w:t>
+      </w:r>
+      <w:proofErr w:type="spellStart"/>
+      <w:r>
+        <w:rPr>
+          <w:rFonts w:ascii="Times New Roman" w:hAnsi="Times New Roman" w:cs="Times New Roman"/>
+          <w:sz w:val="24"/>
+          <w:szCs w:val="24"/>
+        </w:rPr>
+        <w:t>ikki</w:t>
+      </w:r>
+      <w:proofErr w:type="spellEnd"/>
+      <w:r>
+        <w:rPr>
+          <w:rFonts w:ascii="Times New Roman" w:hAnsi="Times New Roman" w:cs="Times New Roman"/>
+          <w:sz w:val="24"/>
+          <w:szCs w:val="24"/>
+        </w:rPr>
+        <w:t xml:space="preserve"> </w:t>
+      </w:r>
+      <w:proofErr w:type="spellStart"/>
+      <w:r>
+        <w:rPr>
+          <w:rFonts w:ascii="Times New Roman" w:hAnsi="Times New Roman" w:cs="Times New Roman"/>
+          <w:sz w:val="24"/>
+          <w:szCs w:val="24"/>
+        </w:rPr>
+        <w:t>usuldan</w:t>
+      </w:r>
+      <w:proofErr w:type="spellEnd"/>
+      <w:r>
+        <w:rPr>
+          <w:rFonts w:ascii="Times New Roman" w:hAnsi="Times New Roman" w:cs="Times New Roman"/>
+          <w:sz w:val="24"/>
+          <w:szCs w:val="24"/>
+        </w:rPr>
+        <w:t xml:space="preserve"> </w:t>
+      </w:r>
+      <w:proofErr w:type="spellStart"/>
+      <w:r>
+        <w:rPr>
+          <w:rFonts w:ascii="Times New Roman" w:hAnsi="Times New Roman" w:cs="Times New Roman"/>
+          <w:sz w:val="24"/>
+          <w:szCs w:val="24"/>
+        </w:rPr>
+        <w:t>biri</w:t>
+      </w:r>
+      <w:proofErr w:type="spellEnd"/>
+      <w:r>
+        <w:rPr>
+          <w:rFonts w:ascii="Times New Roman" w:hAnsi="Times New Roman" w:cs="Times New Roman"/>
+          <w:sz w:val="24"/>
+          <w:szCs w:val="24"/>
+        </w:rPr>
+        <w:t xml:space="preserve"> </w:t>
+      </w:r>
+      <w:proofErr w:type="spellStart"/>
+      <w:r>
+        <w:rPr>
+          <w:rFonts w:ascii="Times New Roman" w:hAnsi="Times New Roman" w:cs="Times New Roman"/>
+          <w:sz w:val="24"/>
+          <w:szCs w:val="24"/>
+        </w:rPr>
+        <w:t>orqali</w:t>
+      </w:r>
+      <w:proofErr w:type="spellEnd"/>
+      <w:r>
+        <w:rPr>
+          <w:rFonts w:ascii="Times New Roman" w:hAnsi="Times New Roman" w:cs="Times New Roman"/>
+          <w:sz w:val="24"/>
+          <w:szCs w:val="24"/>
+        </w:rPr>
+        <w:t xml:space="preserve"> </w:t>
+      </w:r>
+      <w:proofErr w:type="spellStart"/>
+      <w:r>
+        <w:rPr>
+          <w:rFonts w:ascii="Times New Roman" w:hAnsi="Times New Roman" w:cs="Times New Roman"/>
+          <w:sz w:val="24"/>
+          <w:szCs w:val="24"/>
+        </w:rPr>
+        <w:t>amalga</w:t>
+      </w:r>
+      <w:proofErr w:type="spellEnd"/>
+      <w:r>
+        <w:rPr>
+          <w:rFonts w:ascii="Times New Roman" w:hAnsi="Times New Roman" w:cs="Times New Roman"/>
+          <w:sz w:val="24"/>
+          <w:szCs w:val="24"/>
+        </w:rPr>
+        <w:t xml:space="preserve"> </w:t>
+      </w:r>
+      <w:proofErr w:type="spellStart"/>
+      <w:r>
+        <w:rPr>
+          <w:rFonts w:ascii="Times New Roman" w:hAnsi="Times New Roman" w:cs="Times New Roman"/>
+          <w:sz w:val="24"/>
+          <w:szCs w:val="24"/>
+        </w:rPr>
+        <w:t>oshirishingiz</w:t>
+      </w:r>
+      <w:proofErr w:type="spellEnd"/>
+      <w:r>
+        <w:rPr>
+          <w:rFonts w:ascii="Times New Roman" w:hAnsi="Times New Roman" w:cs="Times New Roman"/>
+          <w:sz w:val="24"/>
+          <w:szCs w:val="24"/>
+        </w:rPr>
+        <w:t xml:space="preserve"> </w:t>
+      </w:r>
+      <w:proofErr w:type="spellStart"/>
+      <w:r>
+        <w:rPr>
+          <w:rFonts w:ascii="Times New Roman" w:hAnsi="Times New Roman" w:cs="Times New Roman"/>
+          <w:sz w:val="24"/>
+          <w:szCs w:val="24"/>
+        </w:rPr>
+        <w:t>mumkin</w:t>
+      </w:r>
+      <w:proofErr w:type="spellEnd"/>
+      <w:r>
+        <w:rPr>
+          <w:rFonts w:ascii="Times New Roman" w:hAnsi="Times New Roman" w:cs="Times New Roman"/>
+          <w:sz w:val="24"/>
+          <w:szCs w:val="24"/>
+        </w:rPr>
+        <w:t>:</w:t>
+      </w:r>
+    </w:p>
+    <w:p>
+      <w:pPr>
+        <w:rPr>
+          <w:rFonts w:ascii="Times New Roman" w:hAnsi="Times New Roman" w:cs="Times New Roman"/>
+          <w:sz w:val="24"/>
+          <w:szCs w:val="24"/>
+        </w:rPr>
+      </w:pPr>
+      <w:r>
+        <w:rPr>
+          <w:rFonts w:ascii="Times New Roman" w:hAnsi="Times New Roman" w:cs="Times New Roman"/>
+          <w:sz w:val="24"/>
+          <w:szCs w:val="24"/>
+        </w:rPr>
+        <w:t xml:space="preserve">- </w:t>
+      </w:r>
+      <w:proofErr w:type="spellStart"/>
+      <w:r>
+        <w:rPr>
+          <w:rFonts w:ascii="Times New Roman" w:hAnsi="Times New Roman" w:cs="Times New Roman"/>
+          <w:sz w:val="24"/>
+          <w:szCs w:val="24"/>
+        </w:rPr>
+        <w:t>RealPay</w:t>
+      </w:r>
+      <w:proofErr w:type="spellEnd"/>
+      <w:r>
+        <w:rPr>
+          <w:rFonts w:ascii="Times New Roman" w:hAnsi="Times New Roman" w:cs="Times New Roman"/>
+          <w:sz w:val="24"/>
+          <w:szCs w:val="24"/>
+        </w:rPr>
+        <w:t xml:space="preserve"> </w:t>
+      </w:r>
+      <w:proofErr w:type="spellStart"/>
+      <w:r>
+        <w:rPr>
+          <w:rFonts w:ascii="Times New Roman" w:hAnsi="Times New Roman" w:cs="Times New Roman"/>
+          <w:sz w:val="24"/>
+          <w:szCs w:val="24"/>
+        </w:rPr>
+        <w:t>tizimi</w:t>
+      </w:r>
+      <w:proofErr w:type="spellEnd"/>
+      <w:r>
+        <w:rPr>
+          <w:rFonts w:ascii="Times New Roman" w:hAnsi="Times New Roman" w:cs="Times New Roman"/>
+          <w:sz w:val="24"/>
+          <w:szCs w:val="24"/>
+        </w:rPr>
+        <w:t xml:space="preserve">: Bank </w:t>
+      </w:r>
+      <w:proofErr w:type="spellStart"/>
+      <w:r>
+        <w:rPr>
+          <w:rFonts w:ascii="Times New Roman" w:hAnsi="Times New Roman" w:cs="Times New Roman"/>
+          <w:sz w:val="24"/>
+          <w:szCs w:val="24"/>
+        </w:rPr>
+        <w:t>plastik</w:t>
+      </w:r>
+      <w:proofErr w:type="spellEnd"/>
+      <w:r>
+        <w:rPr>
+          <w:rFonts w:ascii="Times New Roman" w:hAnsi="Times New Roman" w:cs="Times New Roman"/>
+          <w:sz w:val="24"/>
+          <w:szCs w:val="24"/>
+        </w:rPr>
+        <w:t xml:space="preserve"> </w:t>
+      </w:r>
+      <w:proofErr w:type="spellStart"/>
+      <w:r>
+        <w:rPr>
+          <w:rFonts w:ascii="Times New Roman" w:hAnsi="Times New Roman" w:cs="Times New Roman"/>
+          <w:sz w:val="24"/>
+          <w:szCs w:val="24"/>
+        </w:rPr>
+        <w:t>kartangiz</w:t>
+      </w:r>
+      <w:proofErr w:type="spellEnd"/>
+      <w:r>
+        <w:rPr>
+          <w:rFonts w:ascii="Times New Roman" w:hAnsi="Times New Roman" w:cs="Times New Roman"/>
+          <w:sz w:val="24"/>
+          <w:szCs w:val="24"/>
+        </w:rPr>
+        <w:t xml:space="preserve"> (Uzcard/Humo) </w:t>
+      </w:r>
+      <w:proofErr w:type="spellStart"/>
+      <w:r>
+        <w:rPr>
+          <w:rFonts w:ascii="Times New Roman" w:hAnsi="Times New Roman" w:cs="Times New Roman"/>
+          <w:sz w:val="24"/>
+          <w:szCs w:val="24"/>
+        </w:rPr>
+        <w:t>orqali</w:t>
+      </w:r>
+      <w:proofErr w:type="spellEnd"/>
+      <w:r>
+        <w:rPr>
+          <w:rFonts w:ascii="Times New Roman" w:hAnsi="Times New Roman" w:cs="Times New Roman"/>
+          <w:sz w:val="24"/>
+          <w:szCs w:val="24"/>
+        </w:rPr>
+        <w:t xml:space="preserve"> </w:t>
+      </w:r>
+      <w:proofErr w:type="spellStart"/>
+      <w:r>
+        <w:rPr>
+          <w:rFonts w:ascii="Times New Roman" w:hAnsi="Times New Roman" w:cs="Times New Roman"/>
+          <w:sz w:val="24"/>
+          <w:szCs w:val="24"/>
+        </w:rPr>
+        <w:t>onlayn</w:t>
+      </w:r>
+      <w:proofErr w:type="spellEnd"/>
+      <w:r>
+        <w:rPr>
+          <w:rFonts w:ascii="Times New Roman" w:hAnsi="Times New Roman" w:cs="Times New Roman"/>
+          <w:sz w:val="24"/>
+          <w:szCs w:val="24"/>
+        </w:rPr>
+        <w:t xml:space="preserve"> </w:t>
+      </w:r>
+      <w:proofErr w:type="spellStart"/>
+      <w:r>
+        <w:rPr>
+          <w:rFonts w:ascii="Times New Roman" w:hAnsi="Times New Roman" w:cs="Times New Roman"/>
+          <w:sz w:val="24"/>
+          <w:szCs w:val="24"/>
+        </w:rPr>
+        <w:t>va</w:t>
+      </w:r>
+      <w:proofErr w:type="spellEnd"/>
+      <w:r>
+        <w:rPr>
+          <w:rFonts w:ascii="Times New Roman" w:hAnsi="Times New Roman" w:cs="Times New Roman"/>
+          <w:sz w:val="24"/>
+          <w:szCs w:val="24"/>
+        </w:rPr>
+        <w:t xml:space="preserve"> </w:t>
+      </w:r>
+      <w:proofErr w:type="spellStart"/>
+      <w:r>
+        <w:rPr>
+          <w:rFonts w:ascii="Times New Roman" w:hAnsi="Times New Roman" w:cs="Times New Roman"/>
+          <w:sz w:val="24"/>
+          <w:szCs w:val="24"/>
+        </w:rPr>
+        <w:t>tezkor</w:t>
+      </w:r>
+      <w:proofErr w:type="spellEnd"/>
+      <w:r>
+        <w:rPr>
+          <w:rFonts w:ascii="Times New Roman" w:hAnsi="Times New Roman" w:cs="Times New Roman"/>
+          <w:sz w:val="24"/>
+          <w:szCs w:val="24"/>
+        </w:rPr>
+        <w:t xml:space="preserve"> </w:t>
+      </w:r>
+      <w:proofErr w:type="spellStart"/>
+      <w:r>
+        <w:rPr>
+          <w:rFonts w:ascii="Times New Roman" w:hAnsi="Times New Roman" w:cs="Times New Roman"/>
+          <w:sz w:val="24"/>
+          <w:szCs w:val="24"/>
+        </w:rPr>
+        <w:t>to'lov</w:t>
+      </w:r>
+      <w:proofErr w:type="spellEnd"/>
+      <w:r>
+        <w:rPr>
+          <w:rFonts w:ascii="Times New Roman" w:hAnsi="Times New Roman" w:cs="Times New Roman"/>
+          <w:sz w:val="24"/>
+          <w:szCs w:val="24"/>
+        </w:rPr>
+        <w:t>.</w:t>
+      </w:r>
+    </w:p>
+    <w:p>
+      <w:pPr>
+        <w:rPr>
+          <w:rFonts w:ascii="Times New Roman" w:hAnsi="Times New Roman" w:cs="Times New Roman"/>
+          <w:sz w:val="24"/>
+          <w:szCs w:val="24"/>
+        </w:rPr>
+      </w:pPr>
+      <w:r>
+        <w:rPr>
+          <w:rFonts w:ascii="Times New Roman" w:hAnsi="Times New Roman" w:cs="Times New Roman"/>
+          <w:sz w:val="24"/>
+          <w:szCs w:val="24"/>
+        </w:rPr>
+        <w:t xml:space="preserve">- </w:t>
+      </w:r>
+      <w:r>
+        <w:rPr>
+          <w:rFonts w:ascii="Times New Roman" w:hAnsi="Times New Roman" w:cs="Times New Roman"/>
+          <w:sz w:val="24"/>
+          <w:szCs w:val="24"/>
+        </w:rPr>
+        <w:t xml:space="preserve">Bank </w:t>
+      </w:r>
+      <w:proofErr w:type="spellStart"/>
+      <w:r>
+        <w:rPr>
+          <w:rFonts w:ascii="Times New Roman" w:hAnsi="Times New Roman" w:cs="Times New Roman"/>
+          <w:sz w:val="24"/>
+          <w:szCs w:val="24"/>
+        </w:rPr>
+        <w:t>rekvizitlari</w:t>
+      </w:r>
+      <w:proofErr w:type="spellEnd"/>
+      <w:r>
+        <w:rPr>
+          <w:rFonts w:ascii="Times New Roman" w:hAnsi="Times New Roman" w:cs="Times New Roman"/>
+          <w:sz w:val="24"/>
+          <w:szCs w:val="24"/>
+        </w:rPr>
+        <w:t xml:space="preserve"> </w:t>
+      </w:r>
+      <w:proofErr w:type="spellStart"/>
+      <w:r>
+        <w:rPr>
+          <w:rFonts w:ascii="Times New Roman" w:hAnsi="Times New Roman" w:cs="Times New Roman"/>
+          <w:sz w:val="24"/>
+          <w:szCs w:val="24"/>
+        </w:rPr>
+        <w:t>orqali</w:t>
+      </w:r>
+      <w:proofErr w:type="spellEnd"/>
+      <w:r>
+        <w:rPr>
+          <w:rFonts w:ascii="Times New Roman" w:hAnsi="Times New Roman" w:cs="Times New Roman"/>
+          <w:sz w:val="24"/>
+          <w:szCs w:val="24"/>
+        </w:rPr>
+        <w:t xml:space="preserve">: </w:t>
+      </w:r>
+      <w:proofErr w:type="spellStart"/>
+      <w:r>
+        <w:rPr>
+          <w:rFonts w:ascii="Times New Roman" w:hAnsi="Times New Roman" w:cs="Times New Roman"/>
+          <w:sz w:val="24"/>
+          <w:szCs w:val="24"/>
+        </w:rPr>
+        <w:t>Platformada</w:t>
+      </w:r>
+      <w:proofErr w:type="spellEnd"/>
+      <w:r>
+        <w:rPr>
+          <w:rFonts w:ascii="Times New Roman" w:hAnsi="Times New Roman" w:cs="Times New Roman"/>
+          <w:sz w:val="24"/>
+          <w:szCs w:val="24"/>
+        </w:rPr>
+        <w:t xml:space="preserve"> </w:t>
+      </w:r>
+      <w:proofErr w:type="spellStart"/>
+      <w:r>
+        <w:rPr>
+          <w:rFonts w:ascii="Times New Roman" w:hAnsi="Times New Roman" w:cs="Times New Roman"/>
+          <w:sz w:val="24"/>
+          <w:szCs w:val="24"/>
+        </w:rPr>
+        <w:t>ko'rsatilgan</w:t>
+      </w:r>
+      <w:proofErr w:type="spellEnd"/>
+      <w:r>
+        <w:rPr>
+          <w:rFonts w:ascii="Times New Roman" w:hAnsi="Times New Roman" w:cs="Times New Roman"/>
+          <w:sz w:val="24"/>
+          <w:szCs w:val="24"/>
+        </w:rPr>
+        <w:t xml:space="preserve"> bank </w:t>
+      </w:r>
+      <w:proofErr w:type="spellStart"/>
+      <w:r>
+        <w:rPr>
+          <w:rFonts w:ascii="Times New Roman" w:hAnsi="Times New Roman" w:cs="Times New Roman"/>
+          <w:sz w:val="24"/>
+          <w:szCs w:val="24"/>
+        </w:rPr>
+        <w:t>rekvizitlariga</w:t>
+      </w:r>
+      <w:proofErr w:type="spellEnd"/>
+      <w:r>
+        <w:rPr>
+          <w:rFonts w:ascii="Times New Roman" w:hAnsi="Times New Roman" w:cs="Times New Roman"/>
+          <w:sz w:val="24"/>
+          <w:szCs w:val="24"/>
+        </w:rPr>
+        <w:t xml:space="preserve"> </w:t>
+      </w:r>
+      <w:proofErr w:type="spellStart"/>
+      <w:r>
+        <w:rPr>
+          <w:rFonts w:ascii="Times New Roman" w:hAnsi="Times New Roman" w:cs="Times New Roman"/>
+          <w:sz w:val="24"/>
+          <w:szCs w:val="24"/>
+        </w:rPr>
+        <w:t>o'z</w:t>
+      </w:r>
+      <w:proofErr w:type="spellEnd"/>
+      <w:r>
+        <w:rPr>
+          <w:rFonts w:ascii="Times New Roman" w:hAnsi="Times New Roman" w:cs="Times New Roman"/>
+          <w:sz w:val="24"/>
+          <w:szCs w:val="24"/>
+        </w:rPr>
+        <w:t xml:space="preserve"> </w:t>
+      </w:r>
+      <w:proofErr w:type="spellStart"/>
+      <w:r>
+        <w:rPr>
+          <w:rFonts w:ascii="Times New Roman" w:hAnsi="Times New Roman" w:cs="Times New Roman"/>
+          <w:sz w:val="24"/>
+          <w:szCs w:val="24"/>
+        </w:rPr>
+        <w:t>bankingiz</w:t>
+      </w:r>
+      <w:proofErr w:type="spellEnd"/>
+      <w:r>
+        <w:rPr>
+          <w:rFonts w:ascii="Times New Roman" w:hAnsi="Times New Roman" w:cs="Times New Roman"/>
+          <w:sz w:val="24"/>
+          <w:szCs w:val="24"/>
+        </w:rPr>
+        <w:t xml:space="preserve"> </w:t>
+      </w:r>
+      <w:proofErr w:type="spellStart"/>
+      <w:r>
+        <w:rPr>
+          <w:rFonts w:ascii="Times New Roman" w:hAnsi="Times New Roman" w:cs="Times New Roman"/>
+          <w:sz w:val="24"/>
+          <w:szCs w:val="24"/>
+        </w:rPr>
+        <w:t>orqali</w:t>
+      </w:r>
+      <w:proofErr w:type="spellEnd"/>
+      <w:r>
+        <w:rPr>
+          <w:rFonts w:ascii="Times New Roman" w:hAnsi="Times New Roman" w:cs="Times New Roman"/>
+          <w:sz w:val="24"/>
+          <w:szCs w:val="24"/>
+        </w:rPr>
+        <w:t xml:space="preserve"> </w:t>
+      </w:r>
+      <w:proofErr w:type="spellStart"/>
+      <w:r>
+        <w:rPr>
+          <w:rFonts w:ascii="Times New Roman" w:hAnsi="Times New Roman" w:cs="Times New Roman"/>
+          <w:sz w:val="24"/>
+          <w:szCs w:val="24"/>
+        </w:rPr>
+        <w:t>pul</w:t>
+      </w:r>
+      <w:proofErr w:type="spellEnd"/>
+      <w:r>
+        <w:rPr>
+          <w:rFonts w:ascii="Times New Roman" w:hAnsi="Times New Roman" w:cs="Times New Roman"/>
+          <w:sz w:val="24"/>
+          <w:szCs w:val="24"/>
+        </w:rPr>
+        <w:t xml:space="preserve"> </w:t>
+      </w:r>
+      <w:proofErr w:type="spellStart"/>
+      <w:r>
+        <w:rPr>
+          <w:rFonts w:ascii="Times New Roman" w:hAnsi="Times New Roman" w:cs="Times New Roman"/>
+          <w:sz w:val="24"/>
+          <w:szCs w:val="24"/>
+        </w:rPr>
+        <w:t>ko'chirish</w:t>
+      </w:r>
+      <w:proofErr w:type="spellEnd"/>
+      <w:r>
+        <w:rPr>
+          <w:rFonts w:ascii="Times New Roman" w:hAnsi="Times New Roman" w:cs="Times New Roman"/>
+          <w:sz w:val="24"/>
+          <w:szCs w:val="24"/>
+        </w:rPr>
+        <w:t xml:space="preserve"> (</w:t>
+      </w:r>
+      <w:proofErr w:type="spellStart"/>
+      <w:r>
+        <w:rPr>
+          <w:rFonts w:ascii="Times New Roman" w:hAnsi="Times New Roman" w:cs="Times New Roman"/>
+          <w:sz w:val="24"/>
+          <w:szCs w:val="24"/>
+        </w:rPr>
+        <w:t>perechisleniye</w:t>
+      </w:r>
+      <w:proofErr w:type="spellEnd"/>
+      <w:r>
+        <w:rPr>
+          <w:rFonts w:ascii="Times New Roman" w:hAnsi="Times New Roman" w:cs="Times New Roman"/>
+          <w:sz w:val="24"/>
+          <w:szCs w:val="24"/>
+        </w:rPr>
+        <w:t>).</w:t>
+      </w:r>
     </w:p>
     <w:p>
       <w:pPr>
@@ -29772,6 +31169,7 @@
           <w:sz w:val="24"/>
           <w:szCs w:val="24"/>
         </w:rPr>
+        <w:lastRenderedPageBreak/>
         <w:t>chiqilgan</w:t>
       </w:r>
       <w:proofErr w:type="spellEnd"/>
@@ -31179,7 +32577,6 @@
           <w:sz w:val="24"/>
           <w:szCs w:val="24"/>
         </w:rPr>
-        <w:lastRenderedPageBreak/>
         <w:t xml:space="preserve">Keeping – </w:t>
       </w:r>
       <w:proofErr w:type="spellStart"/>
@@ -35642,6 +37039,7 @@
           <w:sz w:val="24"/>
           <w:szCs w:val="24"/>
         </w:rPr>
+        <w:lastRenderedPageBreak/>
         <w:br/>
       </w:r>
       <w:proofErr w:type="spellStart"/>
@@ -36974,7 +38372,6 @@
           <w:sz w:val="24"/>
           <w:szCs w:val="24"/>
         </w:rPr>
-        <w:lastRenderedPageBreak/>
         <w:t xml:space="preserve">Keeping </w:t>
       </w:r>
       <w:proofErr w:type="spellStart"/>
@@ -41090,6 +42487,7 @@
           <w:sz w:val="24"/>
           <w:szCs w:val="24"/>
         </w:rPr>
+        <w:lastRenderedPageBreak/>
         <w:t>boshqa</w:t>
       </w:r>
       <w:proofErr w:type="spellEnd"/>
@@ -42365,7 +43763,6 @@
           <w:sz w:val="24"/>
           <w:szCs w:val="24"/>
         </w:rPr>
-        <w:lastRenderedPageBreak/>
         <w:t xml:space="preserve">Keeping </w:t>
       </w:r>
       <w:proofErr w:type="spellStart"/>
@@ -45427,6 +46824,7 @@
           <w:sz w:val="24"/>
           <w:szCs w:val="24"/>
         </w:rPr>
+        <w:lastRenderedPageBreak/>
         <w:t>Standard</w:t>
       </w:r>
       <w:r>
@@ -45769,14 +47167,6 @@
           <w:szCs w:val="24"/>
         </w:rPr>
         <w:br/>
-      </w:r>
-      <w:r>
-        <w:rPr>
-          <w:rFonts w:ascii="Times New Roman" w:eastAsia="Times New Roman" w:hAnsi="Times New Roman" w:cs="Times New Roman"/>
-          <w:sz w:val="24"/>
-          <w:szCs w:val="24"/>
-        </w:rPr>
-        <w:lastRenderedPageBreak/>
         <w:t>BHM: 16</w:t>
       </w:r>
       <w:r>

</xml_diff>